<commit_message>
Update payslip template wording
</commit_message>
<xml_diff>
--- a/public/templates/預支獎金.docx
+++ b/public/templates/預支獎金.docx
@@ -577,19 +577,8 @@
                 <w:kern w:val="0"/>
                 <w14:ligatures w14:val="none"/>
               </w:rPr>
-              <w:t xml:space="preserve">備   </w:t>
+              <w:t>備   註</w:t>
             </w:r>
-            <w:proofErr w:type="gramStart"/>
-            <w:r>
-              <w:rPr>
-                <w:rFonts w:ascii="標楷體" w:eastAsia="標楷體" w:hAnsi="標楷體" w:cs="新細明體" w:hint="eastAsia"/>
-                <w:color w:val="000000"/>
-                <w:kern w:val="0"/>
-                <w14:ligatures w14:val="none"/>
-              </w:rPr>
-              <w:t>註</w:t>
-            </w:r>
-            <w:proofErr w:type="gramEnd"/>
           </w:p>
         </w:tc>
         <w:tc>
@@ -616,7 +605,6 @@
                 <w14:ligatures w14:val="none"/>
               </w:rPr>
             </w:pPr>
-            <w:proofErr w:type="gramStart"/>
             <w:r>
               <w:rPr>
                 <w:rFonts w:ascii="標楷體" w:eastAsia="標楷體" w:hAnsi="標楷體" w:cs="新細明體" w:hint="eastAsia"/>
@@ -624,26 +612,7 @@
                 <w:kern w:val="0"/>
                 <w14:ligatures w14:val="none"/>
               </w:rPr>
-              <w:t>居服勞務</w:t>
-            </w:r>
-            <w:proofErr w:type="gramEnd"/>
-            <w:r>
-              <w:rPr>
-                <w:rFonts w:ascii="標楷體" w:eastAsia="標楷體" w:hAnsi="標楷體" w:cs="新細明體" w:hint="eastAsia"/>
-                <w:color w:val="000000"/>
-                <w:kern w:val="0"/>
-                <w14:ligatures w14:val="none"/>
-              </w:rPr>
-              <w:t>所</w:t>
-            </w:r>
-            <w:r>
-              <w:rPr>
-                <w:rFonts w:ascii="標楷體" w:eastAsia="標楷體" w:hAnsi="標楷體" w:cs="新細明體" w:hint="eastAsia"/>
-                <w:color w:val="000000"/>
-                <w:kern w:val="0"/>
-                <w14:ligatures w14:val="none"/>
-              </w:rPr>
-              <w:t>得</w:t>
+              <w:t>政策鼓勵獎金</w:t>
             </w:r>
             <w:r>
               <w:rPr>
@@ -2034,6 +2003,7 @@
   <w:style w:type="character" w:default="1" w:styleId="a0">
     <w:name w:val="Default Paragraph Font"/>
     <w:uiPriority w:val="1"/>
+    <w:semiHidden/>
     <w:unhideWhenUsed/>
   </w:style>
   <w:style w:type="table" w:default="1" w:styleId="a1">

</xml_diff>